<commit_message>
docs: include screenshots for all features in PDF, DOCX, and Markdown research reports
</commit_message>
<xml_diff>
--- a/Project_Report_Research.docx
+++ b/Project_Report_Research.docx
@@ -138,7 +138,7 @@
           <w:rFonts w:ascii="Times New Roman" w:hAnsi="Times New Roman"/>
           <w:sz w:val="24"/>
         </w:rPr>
-        <w:t>5. Section IV: Detailed Component Description</w:t>
+        <w:t>5. Section IV: Detailed Component Description &amp; Screen Visuals</w:t>
         <w:br/>
       </w:r>
       <w:r>
@@ -371,13 +371,27 @@
           <w:color w:val="2C3E50"/>
           <w:sz w:val="28"/>
         </w:rPr>
-        <w:t>5. SECTION IV: DETAILED COMPONENT DESCRIPTION</w:t>
+        <w:t>5. SECTION IV: DETAILED COMPONENT DESCRIPTION &amp; SCREEN VISUALS</w:t>
       </w:r>
     </w:p>
     <w:p>
       <w:pPr>
-        <w:pStyle w:val="ListBullet"/>
-        <w:spacing w:after="60" w:line="276" w:lineRule="auto"/>
+        <w:pStyle w:val="Heading2"/>
+        <w:spacing w:before="240" w:after="80"/>
+      </w:pPr>
+      <w:r>
+        <w:rPr>
+          <w:rFonts w:ascii="Times New Roman" w:hAnsi="Times New Roman"/>
+          <w:b/>
+          <w:color w:val="34495E"/>
+          <w:sz w:val="24"/>
+        </w:rPr>
+        <w:t>5.1 Application Landing Interface</w:t>
+      </w:r>
+    </w:p>
+    <w:p>
+      <w:pPr>
+        <w:spacing w:line="276" w:lineRule="auto" w:after="120"/>
         <w:jc w:val="both"/>
       </w:pPr>
       <w:r>
@@ -385,13 +399,77 @@
           <w:rFonts w:ascii="Times New Roman" w:hAnsi="Times New Roman"/>
           <w:sz w:val="23"/>
         </w:rPr>
-        <w:t>Authentication Module: Controls secure login and registration with mock database files. Restricts access to student and admin pages through custom router validation.</w:t>
+        <w:t>The application landing page features a premium dark-themed layout with glassmorphic cards. It provides immediate access routes for logging in ('Enter the Arena') or exploring features. The interface incorporates interactive sound triggers configured within the AppState context.</w:t>
+      </w:r>
+    </w:p>
+    <w:p>
+      <w:r>
+        <w:drawing>
+          <wp:inline xmlns:a="http://schemas.openxmlformats.org/drawingml/2006/main" xmlns:pic="http://schemas.openxmlformats.org/drawingml/2006/picture">
+            <wp:extent cx="5120640" cy="3606238"/>
+            <wp:docPr id="1" name="Picture 1"/>
+            <wp:cNvGraphicFramePr>
+              <a:graphicFrameLocks noChangeAspect="1"/>
+            </wp:cNvGraphicFramePr>
+            <a:graphic>
+              <a:graphicData uri="http://schemas.openxmlformats.org/drawingml/2006/picture">
+                <pic:pic>
+                  <pic:nvPicPr>
+                    <pic:cNvPr id="0" name="homepage_top_1783674173566.png"/>
+                    <pic:cNvPicPr/>
+                  </pic:nvPicPr>
+                  <pic:blipFill>
+                    <a:blip r:embed="rId9"/>
+                    <a:stretch>
+                      <a:fillRect/>
+                    </a:stretch>
+                  </pic:blipFill>
+                  <pic:spPr>
+                    <a:xfrm>
+                      <a:off x="0" y="0"/>
+                      <a:ext cx="5120640" cy="3606238"/>
+                    </a:xfrm>
+                    <a:prstGeom prst="rect"/>
+                  </pic:spPr>
+                </pic:pic>
+              </a:graphicData>
+            </a:graphic>
+          </wp:inline>
+        </w:drawing>
       </w:r>
     </w:p>
     <w:p>
       <w:pPr>
-        <w:pStyle w:val="ListBullet"/>
-        <w:spacing w:after="60" w:line="276" w:lineRule="auto"/>
+        <w:spacing w:after="240"/>
+        <w:jc w:val="center"/>
+      </w:pPr>
+      <w:r>
+        <w:rPr>
+          <w:rFonts w:ascii="Times New Roman" w:hAnsi="Times New Roman"/>
+          <w:i/>
+          <w:sz w:val="20"/>
+        </w:rPr>
+        <w:t>Fig. 1. Landing Hero Page showcasing custom CSS styling and introductory calls to action.</w:t>
+      </w:r>
+    </w:p>
+    <w:p>
+      <w:pPr>
+        <w:pStyle w:val="Heading2"/>
+        <w:spacing w:before="240" w:after="80"/>
+      </w:pPr>
+      <w:r>
+        <w:rPr>
+          <w:rFonts w:ascii="Times New Roman" w:hAnsi="Times New Roman"/>
+          <w:b/>
+          <w:color w:val="34495E"/>
+          <w:sz w:val="24"/>
+        </w:rPr>
+        <w:t>5.2 Student Metrics Dashboard</w:t>
+      </w:r>
+    </w:p>
+    <w:p>
+      <w:pPr>
+        <w:spacing w:line="276" w:lineRule="auto" w:after="120"/>
         <w:jc w:val="both"/>
       </w:pPr>
       <w:r>
@@ -399,13 +477,77 @@
           <w:rFonts w:ascii="Times New Roman" w:hAnsi="Times New Roman"/>
           <w:sz w:val="23"/>
         </w:rPr>
-        <w:t>DSA Lab Sandbox: Displays live graphs and nodes. Allows elements insertion, deletion, and searching. Highlights active search bounds or traversal paths with contrasting color highlights.</w:t>
+        <w:t>Once authenticated, the user is presented with a dashboard mapping their statistics: Average Score, Questions Solved, Streaks, and a weak subject indicator based on past test accuracy. The metrics are displayed using responsive Recharts diagrams.</w:t>
+      </w:r>
+    </w:p>
+    <w:p>
+      <w:r>
+        <w:drawing>
+          <wp:inline xmlns:a="http://schemas.openxmlformats.org/drawingml/2006/main" xmlns:pic="http://schemas.openxmlformats.org/drawingml/2006/picture">
+            <wp:extent cx="5120640" cy="3606238"/>
+            <wp:docPr id="2" name="Picture 2"/>
+            <wp:cNvGraphicFramePr>
+              <a:graphicFrameLocks noChangeAspect="1"/>
+            </wp:cNvGraphicFramePr>
+            <a:graphic>
+              <a:graphicData uri="http://schemas.openxmlformats.org/drawingml/2006/picture">
+                <pic:pic>
+                  <pic:nvPicPr>
+                    <pic:cNvPr id="0" name="dashboard_view_1783676020646.png"/>
+                    <pic:cNvPicPr/>
+                  </pic:nvPicPr>
+                  <pic:blipFill>
+                    <a:blip r:embed="rId10"/>
+                    <a:stretch>
+                      <a:fillRect/>
+                    </a:stretch>
+                  </pic:blipFill>
+                  <pic:spPr>
+                    <a:xfrm>
+                      <a:off x="0" y="0"/>
+                      <a:ext cx="5120640" cy="3606238"/>
+                    </a:xfrm>
+                    <a:prstGeom prst="rect"/>
+                  </pic:spPr>
+                </pic:pic>
+              </a:graphicData>
+            </a:graphic>
+          </wp:inline>
+        </w:drawing>
       </w:r>
     </w:p>
     <w:p>
       <w:pPr>
-        <w:pStyle w:val="ListBullet"/>
-        <w:spacing w:after="60" w:line="276" w:lineRule="auto"/>
+        <w:spacing w:after="240"/>
+        <w:jc w:val="center"/>
+      </w:pPr>
+      <w:r>
+        <w:rPr>
+          <w:rFonts w:ascii="Times New Roman" w:hAnsi="Times New Roman"/>
+          <w:i/>
+          <w:sz w:val="20"/>
+        </w:rPr>
+        <w:t>Fig. 2. Student Dashboard with live statistic counters, recent attempts logging, and subject recommendations.</w:t>
+      </w:r>
+    </w:p>
+    <w:p>
+      <w:pPr>
+        <w:pStyle w:val="Heading2"/>
+        <w:spacing w:before="240" w:after="80"/>
+      </w:pPr>
+      <w:r>
+        <w:rPr>
+          <w:rFonts w:ascii="Times New Roman" w:hAnsi="Times New Roman"/>
+          <w:b/>
+          <w:color w:val="34495E"/>
+          <w:sz w:val="24"/>
+        </w:rPr>
+        <w:t>5.3 Interactive DSA Code Lab</w:t>
+      </w:r>
+    </w:p>
+    <w:p>
+      <w:pPr>
+        <w:spacing w:line="276" w:lineRule="auto" w:after="120"/>
         <w:jc w:val="both"/>
       </w:pPr>
       <w:r>
@@ -413,13 +555,77 @@
           <w:rFonts w:ascii="Times New Roman" w:hAnsi="Times New Roman"/>
           <w:sz w:val="23"/>
         </w:rPr>
-        <w:t>Adaptive Quiz Sandbox: Standardizes multi-format questions (Code outputs, step ordering, drag-and-drop). Tracks streaks and time parameters.</w:t>
+        <w:t>The DSA Lab module contains visualizer sandboxes for Tries, Heaps, BSTs, Queues, Graphs, and sorting visualizers. It maps the class properties in the TypeScript DSA engines to structural nodes in the UI. Users can perform operations such as insertion, search, and deletion, and trace the changes in real-time.</w:t>
+      </w:r>
+    </w:p>
+    <w:p>
+      <w:r>
+        <w:drawing>
+          <wp:inline xmlns:a="http://schemas.openxmlformats.org/drawingml/2006/main" xmlns:pic="http://schemas.openxmlformats.org/drawingml/2006/picture">
+            <wp:extent cx="5120640" cy="3606238"/>
+            <wp:docPr id="3" name="Picture 3"/>
+            <wp:cNvGraphicFramePr>
+              <a:graphicFrameLocks noChangeAspect="1"/>
+            </wp:cNvGraphicFramePr>
+            <a:graphic>
+              <a:graphicData uri="http://schemas.openxmlformats.org/drawingml/2006/picture">
+                <pic:pic>
+                  <pic:nvPicPr>
+                    <pic:cNvPr id="0" name="dsalab_view_1783676037337.png"/>
+                    <pic:cNvPicPr/>
+                  </pic:nvPicPr>
+                  <pic:blipFill>
+                    <a:blip r:embed="rId11"/>
+                    <a:stretch>
+                      <a:fillRect/>
+                    </a:stretch>
+                  </pic:blipFill>
+                  <pic:spPr>
+                    <a:xfrm>
+                      <a:off x="0" y="0"/>
+                      <a:ext cx="5120640" cy="3606238"/>
+                    </a:xfrm>
+                    <a:prstGeom prst="rect"/>
+                  </pic:spPr>
+                </pic:pic>
+              </a:graphicData>
+            </a:graphic>
+          </wp:inline>
+        </w:drawing>
       </w:r>
     </w:p>
     <w:p>
       <w:pPr>
-        <w:pStyle w:val="ListBullet"/>
-        <w:spacing w:after="60" w:line="276" w:lineRule="auto"/>
+        <w:spacing w:after="240"/>
+        <w:jc w:val="center"/>
+      </w:pPr>
+      <w:r>
+        <w:rPr>
+          <w:rFonts w:ascii="Times New Roman" w:hAnsi="Times New Roman"/>
+          <w:i/>
+          <w:sz w:val="20"/>
+        </w:rPr>
+        <w:t>Fig. 3. Interactive DSA Lab visualization canvas rendering tree structures dynamically.</w:t>
+      </w:r>
+    </w:p>
+    <w:p>
+      <w:pPr>
+        <w:pStyle w:val="Heading2"/>
+        <w:spacing w:before="240" w:after="80"/>
+      </w:pPr>
+      <w:r>
+        <w:rPr>
+          <w:rFonts w:ascii="Times New Roman" w:hAnsi="Times New Roman"/>
+          <w:b/>
+          <w:color w:val="34495E"/>
+          <w:sz w:val="24"/>
+        </w:rPr>
+        <w:t>5.4 Quiz Selection &amp; Play Arenas</w:t>
+      </w:r>
+    </w:p>
+    <w:p>
+      <w:pPr>
+        <w:spacing w:line="276" w:lineRule="auto" w:after="120"/>
         <w:jc w:val="both"/>
       </w:pPr>
       <w:r>
@@ -427,13 +633,127 @@
           <w:rFonts w:ascii="Times New Roman" w:hAnsi="Times New Roman"/>
           <w:sz w:val="23"/>
         </w:rPr>
-        <w:t>Multiplayer Competitive Lobbies: Emulates real-time peer battles. Broadcasts competitor scores to a waiting lobby using room identifiers.</w:t>
+        <w:t>The Quiz Arena allows students to choose subjects (Data Structures, OS, Database Systems, etc.) and complete timed quizzes. The Active Quiz Interface renders questions dynamically and adapts difficulty using accuracy trends.</w:t>
+      </w:r>
+    </w:p>
+    <w:p>
+      <w:r>
+        <w:drawing>
+          <wp:inline xmlns:a="http://schemas.openxmlformats.org/drawingml/2006/main" xmlns:pic="http://schemas.openxmlformats.org/drawingml/2006/picture">
+            <wp:extent cx="5120640" cy="3606238"/>
+            <wp:docPr id="4" name="Picture 4"/>
+            <wp:cNvGraphicFramePr>
+              <a:graphicFrameLocks noChangeAspect="1"/>
+            </wp:cNvGraphicFramePr>
+            <a:graphic>
+              <a:graphicData uri="http://schemas.openxmlformats.org/drawingml/2006/picture">
+                <pic:pic>
+                  <pic:nvPicPr>
+                    <pic:cNvPr id="0" name="quiz_selection_view_1783676053537.png"/>
+                    <pic:cNvPicPr/>
+                  </pic:nvPicPr>
+                  <pic:blipFill>
+                    <a:blip r:embed="rId12"/>
+                    <a:stretch>
+                      <a:fillRect/>
+                    </a:stretch>
+                  </pic:blipFill>
+                  <pic:spPr>
+                    <a:xfrm>
+                      <a:off x="0" y="0"/>
+                      <a:ext cx="5120640" cy="3606238"/>
+                    </a:xfrm>
+                    <a:prstGeom prst="rect"/>
+                  </pic:spPr>
+                </pic:pic>
+              </a:graphicData>
+            </a:graphic>
+          </wp:inline>
+        </w:drawing>
       </w:r>
     </w:p>
     <w:p>
       <w:pPr>
-        <w:pStyle w:val="ListBullet"/>
-        <w:spacing w:after="60" w:line="276" w:lineRule="auto"/>
+        <w:spacing w:after="240"/>
+        <w:jc w:val="center"/>
+      </w:pPr>
+      <w:r>
+        <w:rPr>
+          <w:rFonts w:ascii="Times New Roman" w:hAnsi="Times New Roman"/>
+          <w:i/>
+          <w:sz w:val="20"/>
+        </w:rPr>
+        <w:t>Fig. 4. Subject Selection cards mapping syllabus modules in the testing arena.</w:t>
+      </w:r>
+    </w:p>
+    <w:p>
+      <w:r>
+        <w:drawing>
+          <wp:inline xmlns:a="http://schemas.openxmlformats.org/drawingml/2006/main" xmlns:pic="http://schemas.openxmlformats.org/drawingml/2006/picture">
+            <wp:extent cx="5120640" cy="3606238"/>
+            <wp:docPr id="5" name="Picture 5"/>
+            <wp:cNvGraphicFramePr>
+              <a:graphicFrameLocks noChangeAspect="1"/>
+            </wp:cNvGraphicFramePr>
+            <a:graphic>
+              <a:graphicData uri="http://schemas.openxmlformats.org/drawingml/2006/picture">
+                <pic:pic>
+                  <pic:nvPicPr>
+                    <pic:cNvPr id="0" name="quiz_play_view_1783676065250.png"/>
+                    <pic:cNvPicPr/>
+                  </pic:nvPicPr>
+                  <pic:blipFill>
+                    <a:blip r:embed="rId13"/>
+                    <a:stretch>
+                      <a:fillRect/>
+                    </a:stretch>
+                  </pic:blipFill>
+                  <pic:spPr>
+                    <a:xfrm>
+                      <a:off x="0" y="0"/>
+                      <a:ext cx="5120640" cy="3606238"/>
+                    </a:xfrm>
+                    <a:prstGeom prst="rect"/>
+                  </pic:spPr>
+                </pic:pic>
+              </a:graphicData>
+            </a:graphic>
+          </wp:inline>
+        </w:drawing>
+      </w:r>
+    </w:p>
+    <w:p>
+      <w:pPr>
+        <w:spacing w:after="240"/>
+        <w:jc w:val="center"/>
+      </w:pPr>
+      <w:r>
+        <w:rPr>
+          <w:rFonts w:ascii="Times New Roman" w:hAnsi="Times New Roman"/>
+          <w:i/>
+          <w:sz w:val="20"/>
+        </w:rPr>
+        <w:t>Fig. 5. Timed Quiz Sandbox rendering MCQs, code-completion items, and local response feedback.</w:t>
+      </w:r>
+    </w:p>
+    <w:p>
+      <w:pPr>
+        <w:pStyle w:val="Heading2"/>
+        <w:spacing w:before="240" w:after="80"/>
+      </w:pPr>
+      <w:r>
+        <w:rPr>
+          <w:rFonts w:ascii="Times New Roman" w:hAnsi="Times New Roman"/>
+          <w:b/>
+          <w:color w:val="34495E"/>
+          <w:sz w:val="24"/>
+        </w:rPr>
+        <w:t>5.5 Multiplayer Competitive Battles</w:t>
+      </w:r>
+    </w:p>
+    <w:p>
+      <w:pPr>
+        <w:spacing w:line="276" w:lineRule="auto" w:after="120"/>
         <w:jc w:val="both"/>
       </w:pPr>
       <w:r>
@@ -441,7 +761,369 @@
           <w:rFonts w:ascii="Times New Roman" w:hAnsi="Times New Roman"/>
           <w:sz w:val="23"/>
         </w:rPr>
-        <w:t>Dashboard Analytics: Displays historical quiz scores and identifies weakness areas using Recharts Radar and Area diagrams.</w:t>
+        <w:t>The Multiplayer lobby handles peer room sessions. Users can create a lobby or join an existing battle using unique codes. Leaderboards are updated dynamically during active battles to drive competitive motivation.</w:t>
+      </w:r>
+    </w:p>
+    <w:p>
+      <w:r>
+        <w:drawing>
+          <wp:inline xmlns:a="http://schemas.openxmlformats.org/drawingml/2006/main" xmlns:pic="http://schemas.openxmlformats.org/drawingml/2006/picture">
+            <wp:extent cx="5120640" cy="3606238"/>
+            <wp:docPr id="6" name="Picture 6"/>
+            <wp:cNvGraphicFramePr>
+              <a:graphicFrameLocks noChangeAspect="1"/>
+            </wp:cNvGraphicFramePr>
+            <a:graphic>
+              <a:graphicData uri="http://schemas.openxmlformats.org/drawingml/2006/picture">
+                <pic:pic>
+                  <pic:nvPicPr>
+                    <pic:cNvPr id="0" name="multiplayer_view_1783676077447.png"/>
+                    <pic:cNvPicPr/>
+                  </pic:nvPicPr>
+                  <pic:blipFill>
+                    <a:blip r:embed="rId14"/>
+                    <a:stretch>
+                      <a:fillRect/>
+                    </a:stretch>
+                  </pic:blipFill>
+                  <pic:spPr>
+                    <a:xfrm>
+                      <a:off x="0" y="0"/>
+                      <a:ext cx="5120640" cy="3606238"/>
+                    </a:xfrm>
+                    <a:prstGeom prst="rect"/>
+                  </pic:spPr>
+                </pic:pic>
+              </a:graphicData>
+            </a:graphic>
+          </wp:inline>
+        </w:drawing>
+      </w:r>
+    </w:p>
+    <w:p>
+      <w:pPr>
+        <w:spacing w:after="240"/>
+        <w:jc w:val="center"/>
+      </w:pPr>
+      <w:r>
+        <w:rPr>
+          <w:rFonts w:ascii="Times New Roman" w:hAnsi="Times New Roman"/>
+          <w:i/>
+          <w:sz w:val="20"/>
+        </w:rPr>
+        <w:t>Fig. 6. Multiplayer Matchmaking Room lobby showing room creation tools and live status.</w:t>
+      </w:r>
+    </w:p>
+    <w:p>
+      <w:pPr>
+        <w:pStyle w:val="Heading2"/>
+        <w:spacing w:before="240" w:after="80"/>
+      </w:pPr>
+      <w:r>
+        <w:rPr>
+          <w:rFonts w:ascii="Times New Roman" w:hAnsi="Times New Roman"/>
+          <w:b/>
+          <w:color w:val="34495E"/>
+          <w:sz w:val="24"/>
+        </w:rPr>
+        <w:t>5.6 Global Student Standings</w:t>
+      </w:r>
+    </w:p>
+    <w:p>
+      <w:pPr>
+        <w:spacing w:line="276" w:lineRule="auto" w:after="120"/>
+        <w:jc w:val="both"/>
+      </w:pPr>
+      <w:r>
+        <w:rPr>
+          <w:rFonts w:ascii="Times New Roman" w:hAnsi="Times New Roman"/>
+          <w:sz w:val="23"/>
+        </w:rPr>
+        <w:t>Renders global student rankings based on XP, correctness, and streak parameters. Helps maintain healthy peer competition across the user base.</w:t>
+      </w:r>
+    </w:p>
+    <w:p>
+      <w:r>
+        <w:drawing>
+          <wp:inline xmlns:a="http://schemas.openxmlformats.org/drawingml/2006/main" xmlns:pic="http://schemas.openxmlformats.org/drawingml/2006/picture">
+            <wp:extent cx="5120640" cy="3606238"/>
+            <wp:docPr id="7" name="Picture 7"/>
+            <wp:cNvGraphicFramePr>
+              <a:graphicFrameLocks noChangeAspect="1"/>
+            </wp:cNvGraphicFramePr>
+            <a:graphic>
+              <a:graphicData uri="http://schemas.openxmlformats.org/drawingml/2006/picture">
+                <pic:pic>
+                  <pic:nvPicPr>
+                    <pic:cNvPr id="0" name="leaderboard_view_1783676086064.png"/>
+                    <pic:cNvPicPr/>
+                  </pic:nvPicPr>
+                  <pic:blipFill>
+                    <a:blip r:embed="rId15"/>
+                    <a:stretch>
+                      <a:fillRect/>
+                    </a:stretch>
+                  </pic:blipFill>
+                  <pic:spPr>
+                    <a:xfrm>
+                      <a:off x="0" y="0"/>
+                      <a:ext cx="5120640" cy="3606238"/>
+                    </a:xfrm>
+                    <a:prstGeom prst="rect"/>
+                  </pic:spPr>
+                </pic:pic>
+              </a:graphicData>
+            </a:graphic>
+          </wp:inline>
+        </w:drawing>
+      </w:r>
+    </w:p>
+    <w:p>
+      <w:pPr>
+        <w:spacing w:after="240"/>
+        <w:jc w:val="center"/>
+      </w:pPr>
+      <w:r>
+        <w:rPr>
+          <w:rFonts w:ascii="Times New Roman" w:hAnsi="Times New Roman"/>
+          <w:i/>
+          <w:sz w:val="20"/>
+        </w:rPr>
+        <w:t>Fig. 7. Leaderboard ranking portal sorting high-performing students.</w:t>
+      </w:r>
+    </w:p>
+    <w:p>
+      <w:pPr>
+        <w:pStyle w:val="Heading2"/>
+        <w:spacing w:before="240" w:after="80"/>
+      </w:pPr>
+      <w:r>
+        <w:rPr>
+          <w:rFonts w:ascii="Times New Roman" w:hAnsi="Times New Roman"/>
+          <w:b/>
+          <w:color w:val="34495E"/>
+          <w:sz w:val="24"/>
+        </w:rPr>
+        <w:t>5.7 Brain Gym &amp; Mini-Games</w:t>
+      </w:r>
+    </w:p>
+    <w:p>
+      <w:pPr>
+        <w:spacing w:line="276" w:lineRule="auto" w:after="120"/>
+        <w:jc w:val="both"/>
+      </w:pPr>
+      <w:r>
+        <w:rPr>
+          <w:rFonts w:ascii="Times New Roman" w:hAnsi="Times New Roman"/>
+          <w:sz w:val="23"/>
+        </w:rPr>
+        <w:t>Contains gamified mini-games, daily quests, and the daily rewards wheel. Users can claim coins and level-up milestones. The spin wheel is animated using Framer Motion transition curves.</w:t>
+      </w:r>
+    </w:p>
+    <w:p>
+      <w:r>
+        <w:drawing>
+          <wp:inline xmlns:a="http://schemas.openxmlformats.org/drawingml/2006/main" xmlns:pic="http://schemas.openxmlformats.org/drawingml/2006/picture">
+            <wp:extent cx="5120640" cy="3606238"/>
+            <wp:docPr id="8" name="Picture 8"/>
+            <wp:cNvGraphicFramePr>
+              <a:graphicFrameLocks noChangeAspect="1"/>
+            </wp:cNvGraphicFramePr>
+            <a:graphic>
+              <a:graphicData uri="http://schemas.openxmlformats.org/drawingml/2006/picture">
+                <pic:pic>
+                  <pic:nvPicPr>
+                    <pic:cNvPr id="0" name="braingym_view_1783676132832.png"/>
+                    <pic:cNvPicPr/>
+                  </pic:nvPicPr>
+                  <pic:blipFill>
+                    <a:blip r:embed="rId16"/>
+                    <a:stretch>
+                      <a:fillRect/>
+                    </a:stretch>
+                  </pic:blipFill>
+                  <pic:spPr>
+                    <a:xfrm>
+                      <a:off x="0" y="0"/>
+                      <a:ext cx="5120640" cy="3606238"/>
+                    </a:xfrm>
+                    <a:prstGeom prst="rect"/>
+                  </pic:spPr>
+                </pic:pic>
+              </a:graphicData>
+            </a:graphic>
+          </wp:inline>
+        </w:drawing>
+      </w:r>
+    </w:p>
+    <w:p>
+      <w:pPr>
+        <w:spacing w:after="240"/>
+        <w:jc w:val="center"/>
+      </w:pPr>
+      <w:r>
+        <w:rPr>
+          <w:rFonts w:ascii="Times New Roman" w:hAnsi="Times New Roman"/>
+          <w:i/>
+          <w:sz w:val="20"/>
+        </w:rPr>
+        <w:t>Fig. 8. Brain Gym module incorporating rewards wheel and progress milestones.</w:t>
+      </w:r>
+    </w:p>
+    <w:p>
+      <w:pPr>
+        <w:pStyle w:val="Heading2"/>
+        <w:spacing w:before="240" w:after="80"/>
+      </w:pPr>
+      <w:r>
+        <w:rPr>
+          <w:rFonts w:ascii="Times New Roman" w:hAnsi="Times New Roman"/>
+          <w:b/>
+          <w:color w:val="34495E"/>
+          <w:sz w:val="24"/>
+        </w:rPr>
+        <w:t>5.8 User Profile &amp; Achievements</w:t>
+      </w:r>
+    </w:p>
+    <w:p>
+      <w:pPr>
+        <w:spacing w:line="276" w:lineRule="auto" w:after="120"/>
+        <w:jc w:val="both"/>
+      </w:pPr>
+      <w:r>
+        <w:rPr>
+          <w:rFonts w:ascii="Times New Roman" w:hAnsi="Times New Roman"/>
+          <w:sz w:val="23"/>
+        </w:rPr>
+        <w:t>Displays the student's personal account info, certificates (which can be printed directly with unique QR verification IDs), and detailed historical logs.</w:t>
+      </w:r>
+    </w:p>
+    <w:p>
+      <w:r>
+        <w:drawing>
+          <wp:inline xmlns:a="http://schemas.openxmlformats.org/drawingml/2006/main" xmlns:pic="http://schemas.openxmlformats.org/drawingml/2006/picture">
+            <wp:extent cx="5120640" cy="3606238"/>
+            <wp:docPr id="9" name="Picture 9"/>
+            <wp:cNvGraphicFramePr>
+              <a:graphicFrameLocks noChangeAspect="1"/>
+            </wp:cNvGraphicFramePr>
+            <a:graphic>
+              <a:graphicData uri="http://schemas.openxmlformats.org/drawingml/2006/picture">
+                <pic:pic>
+                  <pic:nvPicPr>
+                    <pic:cNvPr id="0" name="profile_view_1783676142191.png"/>
+                    <pic:cNvPicPr/>
+                  </pic:nvPicPr>
+                  <pic:blipFill>
+                    <a:blip r:embed="rId17"/>
+                    <a:stretch>
+                      <a:fillRect/>
+                    </a:stretch>
+                  </pic:blipFill>
+                  <pic:spPr>
+                    <a:xfrm>
+                      <a:off x="0" y="0"/>
+                      <a:ext cx="5120640" cy="3606238"/>
+                    </a:xfrm>
+                    <a:prstGeom prst="rect"/>
+                  </pic:spPr>
+                </pic:pic>
+              </a:graphicData>
+            </a:graphic>
+          </wp:inline>
+        </w:drawing>
+      </w:r>
+    </w:p>
+    <w:p>
+      <w:pPr>
+        <w:spacing w:after="240"/>
+        <w:jc w:val="center"/>
+      </w:pPr>
+      <w:r>
+        <w:rPr>
+          <w:rFonts w:ascii="Times New Roman" w:hAnsi="Times New Roman"/>
+          <w:i/>
+          <w:sz w:val="20"/>
+        </w:rPr>
+        <w:t>Fig. 9. Student Profile detailing badges, achievements, and account details.</w:t>
+      </w:r>
+    </w:p>
+    <w:p>
+      <w:pPr>
+        <w:pStyle w:val="Heading2"/>
+        <w:spacing w:before="240" w:after="80"/>
+      </w:pPr>
+      <w:r>
+        <w:rPr>
+          <w:rFonts w:ascii="Times New Roman" w:hAnsi="Times New Roman"/>
+          <w:b/>
+          <w:color w:val="34495E"/>
+          <w:sz w:val="24"/>
+        </w:rPr>
+        <w:t>5.9 System Admin Control Center</w:t>
+      </w:r>
+    </w:p>
+    <w:p>
+      <w:pPr>
+        <w:spacing w:line="276" w:lineRule="auto" w:after="120"/>
+        <w:jc w:val="both"/>
+      </w:pPr>
+      <w:r>
+        <w:rPr>
+          <w:rFonts w:ascii="Times New Roman" w:hAnsi="Times New Roman"/>
+          <w:sz w:val="23"/>
+        </w:rPr>
+        <w:t>The Admin Dashboard provides full CRUD capabilities over the question database, user logs, and session statistics. Admins can bulk upload questions via CSV/JSON parse utilities.</w:t>
+      </w:r>
+    </w:p>
+    <w:p>
+      <w:r>
+        <w:drawing>
+          <wp:inline xmlns:a="http://schemas.openxmlformats.org/drawingml/2006/main" xmlns:pic="http://schemas.openxmlformats.org/drawingml/2006/picture">
+            <wp:extent cx="5120640" cy="3606238"/>
+            <wp:docPr id="10" name="Picture 10"/>
+            <wp:cNvGraphicFramePr>
+              <a:graphicFrameLocks noChangeAspect="1"/>
+            </wp:cNvGraphicFramePr>
+            <a:graphic>
+              <a:graphicData uri="http://schemas.openxmlformats.org/drawingml/2006/picture">
+                <pic:pic>
+                  <pic:nvPicPr>
+                    <pic:cNvPr id="0" name="admin_view_1783676516260.png"/>
+                    <pic:cNvPicPr/>
+                  </pic:nvPicPr>
+                  <pic:blipFill>
+                    <a:blip r:embed="rId18"/>
+                    <a:stretch>
+                      <a:fillRect/>
+                    </a:stretch>
+                  </pic:blipFill>
+                  <pic:spPr>
+                    <a:xfrm>
+                      <a:off x="0" y="0"/>
+                      <a:ext cx="5120640" cy="3606238"/>
+                    </a:xfrm>
+                    <a:prstGeom prst="rect"/>
+                  </pic:spPr>
+                </pic:pic>
+              </a:graphicData>
+            </a:graphic>
+          </wp:inline>
+        </w:drawing>
+      </w:r>
+    </w:p>
+    <w:p>
+      <w:pPr>
+        <w:spacing w:after="240"/>
+        <w:jc w:val="center"/>
+      </w:pPr>
+      <w:r>
+        <w:rPr>
+          <w:rFonts w:ascii="Times New Roman" w:hAnsi="Times New Roman"/>
+          <w:i/>
+          <w:sz w:val="20"/>
+        </w:rPr>
+        <w:t>Fig. 10. System Admin Control Panel allowing real-time database management and system overrides.</w:t>
       </w:r>
     </w:p>
     <w:p>
@@ -725,105 +1407,7 @@
           <w:rFonts w:ascii="Times New Roman" w:hAnsi="Times New Roman"/>
           <w:sz w:val="23"/>
         </w:rPr>
-        <w:t>To evaluate the usability and pedagogical effectiveness of AlgoQuiz Pro, user study metrics were collected. The interface performs fluid rendering: loading complex Heap visualization runs in less than 4ms on modern engines. Below are screenshots showing the system interface in production.</w:t>
-      </w:r>
-    </w:p>
-    <w:p>
-      <w:r>
-        <w:drawing>
-          <wp:inline xmlns:a="http://schemas.openxmlformats.org/drawingml/2006/main" xmlns:pic="http://schemas.openxmlformats.org/drawingml/2006/picture">
-            <wp:extent cx="5303520" cy="3735032"/>
-            <wp:docPr id="1" name="Picture 1"/>
-            <wp:cNvGraphicFramePr>
-              <a:graphicFrameLocks noChangeAspect="1"/>
-            </wp:cNvGraphicFramePr>
-            <a:graphic>
-              <a:graphicData uri="http://schemas.openxmlformats.org/drawingml/2006/picture">
-                <pic:pic>
-                  <pic:nvPicPr>
-                    <pic:cNvPr id="0" name="homepage_features_1783674189397.png"/>
-                    <pic:cNvPicPr/>
-                  </pic:nvPicPr>
-                  <pic:blipFill>
-                    <a:blip r:embed="rId9"/>
-                    <a:stretch>
-                      <a:fillRect/>
-                    </a:stretch>
-                  </pic:blipFill>
-                  <pic:spPr>
-                    <a:xfrm>
-                      <a:off x="0" y="0"/>
-                      <a:ext cx="5303520" cy="3735032"/>
-                    </a:xfrm>
-                    <a:prstGeom prst="rect"/>
-                  </pic:spPr>
-                </pic:pic>
-              </a:graphicData>
-            </a:graphic>
-          </wp:inline>
-        </w:drawing>
-      </w:r>
-    </w:p>
-    <w:p>
-      <w:pPr>
-        <w:jc w:val="center"/>
-      </w:pPr>
-      <w:r>
-        <w:rPr>
-          <w:rFonts w:ascii="Times New Roman" w:hAnsi="Times New Roman"/>
-          <w:i/>
-          <w:sz w:val="20"/>
-        </w:rPr>
-        <w:t>Fig. 1. AlgoQuiz Pro features and metrics dash view.</w:t>
-      </w:r>
-    </w:p>
-    <w:p>
-      <w:r>
-        <w:drawing>
-          <wp:inline xmlns:a="http://schemas.openxmlformats.org/drawingml/2006/main" xmlns:pic="http://schemas.openxmlformats.org/drawingml/2006/picture">
-            <wp:extent cx="5303520" cy="3735032"/>
-            <wp:docPr id="2" name="Picture 2"/>
-            <wp:cNvGraphicFramePr>
-              <a:graphicFrameLocks noChangeAspect="1"/>
-            </wp:cNvGraphicFramePr>
-            <a:graphic>
-              <a:graphicData uri="http://schemas.openxmlformats.org/drawingml/2006/picture">
-                <pic:pic>
-                  <pic:nvPicPr>
-                    <pic:cNvPr id="0" name="homepage_top_1783674173566.png"/>
-                    <pic:cNvPicPr/>
-                  </pic:nvPicPr>
-                  <pic:blipFill>
-                    <a:blip r:embed="rId10"/>
-                    <a:stretch>
-                      <a:fillRect/>
-                    </a:stretch>
-                  </pic:blipFill>
-                  <pic:spPr>
-                    <a:xfrm>
-                      <a:off x="0" y="0"/>
-                      <a:ext cx="5303520" cy="3735032"/>
-                    </a:xfrm>
-                    <a:prstGeom prst="rect"/>
-                  </pic:spPr>
-                </pic:pic>
-              </a:graphicData>
-            </a:graphic>
-          </wp:inline>
-        </w:drawing>
-      </w:r>
-    </w:p>
-    <w:p>
-      <w:pPr>
-        <w:jc w:val="center"/>
-      </w:pPr>
-      <w:r>
-        <w:rPr>
-          <w:rFonts w:ascii="Times New Roman" w:hAnsi="Times New Roman"/>
-          <w:i/>
-          <w:sz w:val="20"/>
-        </w:rPr>
-        <w:t>Fig. 2. UI presentation layout and hero stats.</w:t>
+        <w:t>To evaluate the usability and pedagogical effectiveness of AlgoQuiz Pro, user study metrics were collected. The interface performs fluid rendering: loading complex Heap visualization runs in less than 4ms on modern engines. Experimental runs track memory allocations and layout recalculations. Standard components maintain a clean memory footprint, scaling dynamically to trace massive structural mutations.</w:t>
       </w:r>
     </w:p>
     <w:p>
@@ -1367,7 +1951,7 @@
     <w:rPr>
       <w:rFonts w:ascii="Times New Roman" w:hAnsi="Times New Roman"/>
       <w:color w:val="1E1E1E"/>
-      <w:sz w:val="24"/>
+      <w:sz w:val="23"/>
     </w:rPr>
   </w:style>
   <w:style w:type="paragraph" w:styleId="Header">

</xml_diff>